<commit_message>
feat: shell operativa, scheda paziente, EO rapidi, PDF e tooling
- Chrome operativo unificato (header, sidebar, sync, smartphone)
- Scheda: dimissioni, invio ospedale, quick exam EO, tessera/CF, tipi cartella
- Vitest, helper PDF, eoQuickSelection, rank header, .env.example
- Tema CSS, eslint; rimozione PMAImpostazioniPage e Rank.xlsx; aggiornamenti Prompt

Co-authored-by: Cursor <cursoragent@cursor.com>
</commit_message>
<xml_diff>
--- a/Prompt/Bozza organizzazione PMA.docx
+++ b/Prompt/Bozza organizzazione PMA.docx
@@ -268,6 +268,349 @@
     <w:p>
       <w:pPr>
         <w:pStyle w:val="Titolo1"/>
+      </w:pPr>
+      <w:r>
+        <w:t>LOGISTICA</w:t>
+      </w:r>
+    </w:p>
+    <w:tbl>
+      <w:tblPr>
+        <w:tblStyle w:val="Grigliatabella"/>
+        <w:tblW w:w="0" w:type="auto"/>
+        <w:tblLook w:val="04A0" w:firstRow="1" w:lastRow="0" w:firstColumn="1" w:lastColumn="0" w:noHBand="0" w:noVBand="1"/>
+      </w:tblPr>
+      <w:tblGrid>
+        <w:gridCol w:w="4508"/>
+        <w:gridCol w:w="4508"/>
+      </w:tblGrid>
+      <w:tr>
+        <w:tc>
+          <w:tcPr>
+            <w:tcW w:w="4508" w:type="dxa"/>
+          </w:tcPr>
+          <w:p>
+            <w:r>
+              <w:t>Gazebo esterno lato destro</w:t>
+            </w:r>
+          </w:p>
+        </w:tc>
+        <w:tc>
+          <w:tcPr>
+            <w:tcW w:w="4508" w:type="dxa"/>
+          </w:tcPr>
+          <w:p>
+            <w:pPr>
+              <w:rPr>
+                <w:lang w:val="it-IT"/>
+              </w:rPr>
+            </w:pPr>
+            <w:r>
+              <w:rPr>
+                <w:lang w:val="it-IT"/>
+              </w:rPr>
+              <w:t>Lato destro: postazione triage</w:t>
+            </w:r>
+          </w:p>
+          <w:p>
+            <w:pPr>
+              <w:pStyle w:val="Paragrafoelenco"/>
+              <w:numPr>
+                <w:ilvl w:val="0"/>
+                <w:numId w:val="4"/>
+              </w:numPr>
+              <w:rPr>
+                <w:lang w:val="it-IT"/>
+              </w:rPr>
+            </w:pPr>
+            <w:r>
+              <w:rPr>
+                <w:lang w:val="it-IT"/>
+              </w:rPr>
+              <w:t>Tavolo</w:t>
+            </w:r>
+          </w:p>
+          <w:p>
+            <w:pPr>
+              <w:pStyle w:val="Paragrafoelenco"/>
+              <w:numPr>
+                <w:ilvl w:val="0"/>
+                <w:numId w:val="4"/>
+              </w:numPr>
+              <w:rPr>
+                <w:lang w:val="it-IT"/>
+              </w:rPr>
+            </w:pPr>
+            <w:r>
+              <w:rPr>
+                <w:lang w:val="it-IT"/>
+              </w:rPr>
+              <w:t>Sedia</w:t>
+            </w:r>
+          </w:p>
+          <w:p>
+            <w:pPr>
+              <w:pStyle w:val="Paragrafoelenco"/>
+              <w:numPr>
+                <w:ilvl w:val="0"/>
+                <w:numId w:val="4"/>
+              </w:numPr>
+              <w:rPr>
+                <w:lang w:val="it-IT"/>
+              </w:rPr>
+            </w:pPr>
+            <w:r>
+              <w:rPr>
+                <w:lang w:val="it-IT"/>
+              </w:rPr>
+              <w:t>Strumenti per misurazione parametri</w:t>
+            </w:r>
+          </w:p>
+        </w:tc>
+      </w:tr>
+      <w:tr>
+        <w:tc>
+          <w:tcPr>
+            <w:tcW w:w="4508" w:type="dxa"/>
+          </w:tcPr>
+          <w:p>
+            <w:pPr>
+              <w:rPr>
+                <w:lang w:val="it-IT"/>
+              </w:rPr>
+            </w:pPr>
+            <w:r>
+              <w:rPr>
+                <w:lang w:val="it-IT"/>
+              </w:rPr>
+              <w:t>Gazebo esterno lato sinistro</w:t>
+            </w:r>
+          </w:p>
+        </w:tc>
+        <w:tc>
+          <w:tcPr>
+            <w:tcW w:w="4508" w:type="dxa"/>
+          </w:tcPr>
+          <w:p>
+            <w:pPr>
+              <w:rPr>
+                <w:lang w:val="it-IT"/>
+              </w:rPr>
+            </w:pPr>
+            <w:r>
+              <w:rPr>
+                <w:lang w:val="it-IT"/>
+              </w:rPr>
+              <w:t>Postazione codici bianchi con materiale medicazione per IIVV</w:t>
+            </w:r>
+          </w:p>
+        </w:tc>
+      </w:tr>
+      <w:tr>
+        <w:tc>
+          <w:tcPr>
+            <w:tcW w:w="4508" w:type="dxa"/>
+          </w:tcPr>
+          <w:p>
+            <w:pPr>
+              <w:rPr>
+                <w:lang w:val="it-IT"/>
+              </w:rPr>
+            </w:pPr>
+            <w:r>
+              <w:rPr>
+                <w:lang w:val="it-IT"/>
+              </w:rPr>
+              <w:t>Tenda</w:t>
+            </w:r>
+          </w:p>
+        </w:tc>
+        <w:tc>
+          <w:tcPr>
+            <w:tcW w:w="4508" w:type="dxa"/>
+          </w:tcPr>
+          <w:p>
+            <w:pPr>
+              <w:rPr>
+                <w:lang w:val="it-IT"/>
+              </w:rPr>
+            </w:pPr>
+            <w:r>
+              <w:rPr>
+                <w:lang w:val="it-IT"/>
+              </w:rPr>
+              <w:t>N° posti letto XXX</w:t>
+            </w:r>
+          </w:p>
+        </w:tc>
+      </w:tr>
+    </w:tbl>
+    <w:p>
+      <w:pPr>
+        <w:pStyle w:val="Titolo2"/>
+        <w:rPr>
+          <w:lang w:val="it-IT"/>
+        </w:rPr>
+      </w:pPr>
+      <w:r>
+        <w:rPr>
+          <w:lang w:val="it-IT"/>
+        </w:rPr>
+        <w:t>RESCUE TEAM</w:t>
+      </w:r>
+    </w:p>
+    <w:p>
+      <w:pPr>
+        <w:jc w:val="both"/>
+        <w:rPr>
+          <w:lang w:val="it-IT"/>
+        </w:rPr>
+      </w:pPr>
+      <w:r>
+        <w:rPr>
+          <w:lang w:val="it-IT"/>
+        </w:rPr>
+        <w:t>Se paziente necessita di soccorso avanzato viene attivato il rescue team (RT), ovvero medico e infermiere designati si staccano dal PMA con zaino ALS + monitor.</w:t>
+      </w:r>
+    </w:p>
+    <w:p>
+      <w:pPr>
+        <w:pStyle w:val="Paragrafoelenco"/>
+        <w:numPr>
+          <w:ilvl w:val="0"/>
+          <w:numId w:val="5"/>
+        </w:numPr>
+        <w:jc w:val="both"/>
+        <w:rPr>
+          <w:lang w:val="it-IT"/>
+        </w:rPr>
+      </w:pPr>
+      <w:r>
+        <w:rPr>
+          <w:lang w:val="it-IT"/>
+        </w:rPr>
+        <w:t xml:space="preserve">Paziente “pull” </w:t>
+      </w:r>
+      <w:r>
+        <w:rPr>
+          <w:lang w:val="it-IT"/>
+        </w:rPr>
+        <w:sym w:font="Wingdings" w:char="F0E0"/>
+      </w:r>
+      <w:r>
+        <w:rPr>
+          <w:lang w:val="it-IT"/>
+        </w:rPr>
+        <w:t xml:space="preserve"> a vista del personale PMA o segnalato da un astante direttamente dal PMA </w:t>
+      </w:r>
+      <w:r>
+        <w:rPr>
+          <w:lang w:val="it-IT"/>
+        </w:rPr>
+        <w:sym w:font="Wingdings" w:char="F0E0"/>
+      </w:r>
+      <w:r>
+        <w:rPr>
+          <w:lang w:val="it-IT"/>
+        </w:rPr>
+        <w:t xml:space="preserve"> RT si muove e avvisa la centrale per inviare equipaggio +/- MSB</w:t>
+      </w:r>
+    </w:p>
+    <w:p>
+      <w:pPr>
+        <w:pStyle w:val="Paragrafoelenco"/>
+        <w:numPr>
+          <w:ilvl w:val="0"/>
+          <w:numId w:val="5"/>
+        </w:numPr>
+        <w:jc w:val="both"/>
+        <w:rPr>
+          <w:lang w:val="it-IT"/>
+        </w:rPr>
+      </w:pPr>
+      <w:r>
+        <w:rPr>
+          <w:lang w:val="it-IT"/>
+        </w:rPr>
+        <w:t xml:space="preserve">Paziente “push” </w:t>
+      </w:r>
+      <w:r>
+        <w:rPr>
+          <w:lang w:val="it-IT"/>
+        </w:rPr>
+        <w:sym w:font="Wingdings" w:char="F0E0"/>
+      </w:r>
+      <w:r>
+        <w:rPr>
+          <w:lang w:val="it-IT"/>
+        </w:rPr>
+        <w:t xml:space="preserve"> centrale avvisa personale PMA indicando se pz è raggiungibile a piedi o meno.</w:t>
+      </w:r>
+    </w:p>
+    <w:p>
+      <w:pPr>
+        <w:pStyle w:val="Paragrafoelenco"/>
+        <w:numPr>
+          <w:ilvl w:val="1"/>
+          <w:numId w:val="5"/>
+        </w:numPr>
+        <w:jc w:val="both"/>
+        <w:rPr>
+          <w:lang w:val="it-IT"/>
+        </w:rPr>
+      </w:pPr>
+      <w:r>
+        <w:rPr>
+          <w:lang w:val="it-IT"/>
+        </w:rPr>
+        <w:t xml:space="preserve">Raggiungibile a piedi </w:t>
+      </w:r>
+      <w:r>
+        <w:rPr>
+          <w:lang w:val="it-IT"/>
+        </w:rPr>
+        <w:sym w:font="Wingdings" w:char="F0E0"/>
+      </w:r>
+      <w:r>
+        <w:rPr>
+          <w:lang w:val="it-IT"/>
+        </w:rPr>
+        <w:t xml:space="preserve"> RT si muove + centrale attiva altro equipaggio</w:t>
+      </w:r>
+    </w:p>
+    <w:p>
+      <w:pPr>
+        <w:pStyle w:val="Paragrafoelenco"/>
+        <w:numPr>
+          <w:ilvl w:val="1"/>
+          <w:numId w:val="5"/>
+        </w:numPr>
+        <w:jc w:val="both"/>
+        <w:rPr>
+          <w:lang w:val="it-IT"/>
+        </w:rPr>
+      </w:pPr>
+      <w:r>
+        <w:rPr>
+          <w:lang w:val="it-IT"/>
+        </w:rPr>
+        <w:t xml:space="preserve">Non raggiungibile a piedi </w:t>
+      </w:r>
+      <w:r>
+        <w:rPr>
+          <w:lang w:val="it-IT"/>
+        </w:rPr>
+        <w:sym w:font="Wingdings" w:char="F0E0"/>
+      </w:r>
+      <w:r>
+        <w:rPr>
+          <w:lang w:val="it-IT"/>
+        </w:rPr>
+        <w:t xml:space="preserve"> RT si muove con CMR PMA che diventa quindi un MSA</w:t>
+      </w:r>
+    </w:p>
+    <w:p>
+      <w:pPr>
+        <w:pStyle w:val="Titolo1"/>
         <w:rPr>
           <w:lang w:val="it-IT"/>
         </w:rPr>
@@ -447,6 +790,7 @@
         <w:rPr>
           <w:lang w:val="it-IT"/>
         </w:rPr>
+        <w:lastRenderedPageBreak/>
         <w:t xml:space="preserve">Giallo confermato </w:t>
       </w:r>
       <w:r>
@@ -490,8 +834,21 @@
         <w:rPr>
           <w:lang w:val="it-IT"/>
         </w:rPr>
-        <w:t xml:space="preserve"> chiedere ospedalizzazione</w:t>
-      </w:r>
+        <w:t xml:space="preserve"> ammissione diretta area rossi. Se area rossi occupata liberare subito un posto letto “AREA GIALLI”. Allertare centrale subito per informare “CODICE ROSSO” in carico.</w:t>
+      </w:r>
+    </w:p>
+    <w:p>
+      <w:pPr>
+        <w:pStyle w:val="Paragrafoelenco"/>
+        <w:numPr>
+          <w:ilvl w:val="2"/>
+          <w:numId w:val="1"/>
+        </w:numPr>
+        <w:jc w:val="both"/>
+        <w:rPr>
+          <w:lang w:val="it-IT"/>
+        </w:rPr>
+      </w:pPr>
     </w:p>
     <w:p>
       <w:pPr>
@@ -588,21 +945,7 @@
         <w:rPr>
           <w:lang w:val="it-IT"/>
         </w:rPr>
-        <w:t xml:space="preserve">se almeno </w:t>
-      </w:r>
-      <w:proofErr w:type="gramStart"/>
-      <w:r>
-        <w:rPr>
-          <w:lang w:val="it-IT"/>
-        </w:rPr>
-        <w:t>2</w:t>
-      </w:r>
-      <w:proofErr w:type="gramEnd"/>
-      <w:r>
-        <w:rPr>
-          <w:lang w:val="it-IT"/>
-        </w:rPr>
-        <w:t xml:space="preserve"> posti letto liberi invia il paziente</w:t>
+        <w:t>se almeno 2 posti letto liberi invia il paziente</w:t>
       </w:r>
     </w:p>
     <w:p>
@@ -748,7 +1091,6 @@
         <w:rPr>
           <w:lang w:val="it-IT"/>
         </w:rPr>
-        <w:lastRenderedPageBreak/>
         <w:t>Se medico PMA richiede confronto con medico SOREU = si può creare conferenza?</w:t>
       </w:r>
     </w:p>
@@ -1060,6 +1402,232 @@
       </w:pPr>
     </w:lvl>
   </w:abstractNum>
+  <w:abstractNum w:abstractNumId="3" w15:restartNumberingAfterBreak="0">
+    <w:nsid w:val="3F6545E8"/>
+    <w:multiLevelType w:val="hybridMultilevel"/>
+    <w:tmpl w:val="2D36F512"/>
+    <w:lvl w:ilvl="0" w:tplc="08090001">
+      <w:start w:val="1"/>
+      <w:numFmt w:val="bullet"/>
+      <w:lvlText w:val=""/>
+      <w:lvlJc w:val="left"/>
+      <w:pPr>
+        <w:ind w:left="720" w:hanging="360"/>
+      </w:pPr>
+      <w:rPr>
+        <w:rFonts w:ascii="Symbol" w:hAnsi="Symbol" w:hint="default"/>
+      </w:rPr>
+    </w:lvl>
+    <w:lvl w:ilvl="1" w:tplc="08090003" w:tentative="1">
+      <w:start w:val="1"/>
+      <w:numFmt w:val="bullet"/>
+      <w:lvlText w:val="o"/>
+      <w:lvlJc w:val="left"/>
+      <w:pPr>
+        <w:ind w:left="1440" w:hanging="360"/>
+      </w:pPr>
+      <w:rPr>
+        <w:rFonts w:ascii="Courier New" w:hAnsi="Courier New" w:cs="Courier New" w:hint="default"/>
+      </w:rPr>
+    </w:lvl>
+    <w:lvl w:ilvl="2" w:tplc="08090005" w:tentative="1">
+      <w:start w:val="1"/>
+      <w:numFmt w:val="bullet"/>
+      <w:lvlText w:val=""/>
+      <w:lvlJc w:val="left"/>
+      <w:pPr>
+        <w:ind w:left="2160" w:hanging="360"/>
+      </w:pPr>
+      <w:rPr>
+        <w:rFonts w:ascii="Wingdings" w:hAnsi="Wingdings" w:hint="default"/>
+      </w:rPr>
+    </w:lvl>
+    <w:lvl w:ilvl="3" w:tplc="08090001" w:tentative="1">
+      <w:start w:val="1"/>
+      <w:numFmt w:val="bullet"/>
+      <w:lvlText w:val=""/>
+      <w:lvlJc w:val="left"/>
+      <w:pPr>
+        <w:ind w:left="2880" w:hanging="360"/>
+      </w:pPr>
+      <w:rPr>
+        <w:rFonts w:ascii="Symbol" w:hAnsi="Symbol" w:hint="default"/>
+      </w:rPr>
+    </w:lvl>
+    <w:lvl w:ilvl="4" w:tplc="08090003" w:tentative="1">
+      <w:start w:val="1"/>
+      <w:numFmt w:val="bullet"/>
+      <w:lvlText w:val="o"/>
+      <w:lvlJc w:val="left"/>
+      <w:pPr>
+        <w:ind w:left="3600" w:hanging="360"/>
+      </w:pPr>
+      <w:rPr>
+        <w:rFonts w:ascii="Courier New" w:hAnsi="Courier New" w:cs="Courier New" w:hint="default"/>
+      </w:rPr>
+    </w:lvl>
+    <w:lvl w:ilvl="5" w:tplc="08090005" w:tentative="1">
+      <w:start w:val="1"/>
+      <w:numFmt w:val="bullet"/>
+      <w:lvlText w:val=""/>
+      <w:lvlJc w:val="left"/>
+      <w:pPr>
+        <w:ind w:left="4320" w:hanging="360"/>
+      </w:pPr>
+      <w:rPr>
+        <w:rFonts w:ascii="Wingdings" w:hAnsi="Wingdings" w:hint="default"/>
+      </w:rPr>
+    </w:lvl>
+    <w:lvl w:ilvl="6" w:tplc="08090001" w:tentative="1">
+      <w:start w:val="1"/>
+      <w:numFmt w:val="bullet"/>
+      <w:lvlText w:val=""/>
+      <w:lvlJc w:val="left"/>
+      <w:pPr>
+        <w:ind w:left="5040" w:hanging="360"/>
+      </w:pPr>
+      <w:rPr>
+        <w:rFonts w:ascii="Symbol" w:hAnsi="Symbol" w:hint="default"/>
+      </w:rPr>
+    </w:lvl>
+    <w:lvl w:ilvl="7" w:tplc="08090003" w:tentative="1">
+      <w:start w:val="1"/>
+      <w:numFmt w:val="bullet"/>
+      <w:lvlText w:val="o"/>
+      <w:lvlJc w:val="left"/>
+      <w:pPr>
+        <w:ind w:left="5760" w:hanging="360"/>
+      </w:pPr>
+      <w:rPr>
+        <w:rFonts w:ascii="Courier New" w:hAnsi="Courier New" w:cs="Courier New" w:hint="default"/>
+      </w:rPr>
+    </w:lvl>
+    <w:lvl w:ilvl="8" w:tplc="08090005" w:tentative="1">
+      <w:start w:val="1"/>
+      <w:numFmt w:val="bullet"/>
+      <w:lvlText w:val=""/>
+      <w:lvlJc w:val="left"/>
+      <w:pPr>
+        <w:ind w:left="6480" w:hanging="360"/>
+      </w:pPr>
+      <w:rPr>
+        <w:rFonts w:ascii="Wingdings" w:hAnsi="Wingdings" w:hint="default"/>
+      </w:rPr>
+    </w:lvl>
+  </w:abstractNum>
+  <w:abstractNum w:abstractNumId="4" w15:restartNumberingAfterBreak="0">
+    <w:nsid w:val="43392901"/>
+    <w:multiLevelType w:val="hybridMultilevel"/>
+    <w:tmpl w:val="8E746AAA"/>
+    <w:lvl w:ilvl="0" w:tplc="08090001">
+      <w:start w:val="1"/>
+      <w:numFmt w:val="bullet"/>
+      <w:lvlText w:val=""/>
+      <w:lvlJc w:val="left"/>
+      <w:pPr>
+        <w:ind w:left="720" w:hanging="360"/>
+      </w:pPr>
+      <w:rPr>
+        <w:rFonts w:ascii="Symbol" w:hAnsi="Symbol" w:hint="default"/>
+      </w:rPr>
+    </w:lvl>
+    <w:lvl w:ilvl="1" w:tplc="08090003">
+      <w:start w:val="1"/>
+      <w:numFmt w:val="bullet"/>
+      <w:lvlText w:val="o"/>
+      <w:lvlJc w:val="left"/>
+      <w:pPr>
+        <w:ind w:left="1440" w:hanging="360"/>
+      </w:pPr>
+      <w:rPr>
+        <w:rFonts w:ascii="Courier New" w:hAnsi="Courier New" w:cs="Courier New" w:hint="default"/>
+      </w:rPr>
+    </w:lvl>
+    <w:lvl w:ilvl="2" w:tplc="08090005" w:tentative="1">
+      <w:start w:val="1"/>
+      <w:numFmt w:val="bullet"/>
+      <w:lvlText w:val=""/>
+      <w:lvlJc w:val="left"/>
+      <w:pPr>
+        <w:ind w:left="2160" w:hanging="360"/>
+      </w:pPr>
+      <w:rPr>
+        <w:rFonts w:ascii="Wingdings" w:hAnsi="Wingdings" w:hint="default"/>
+      </w:rPr>
+    </w:lvl>
+    <w:lvl w:ilvl="3" w:tplc="08090001" w:tentative="1">
+      <w:start w:val="1"/>
+      <w:numFmt w:val="bullet"/>
+      <w:lvlText w:val=""/>
+      <w:lvlJc w:val="left"/>
+      <w:pPr>
+        <w:ind w:left="2880" w:hanging="360"/>
+      </w:pPr>
+      <w:rPr>
+        <w:rFonts w:ascii="Symbol" w:hAnsi="Symbol" w:hint="default"/>
+      </w:rPr>
+    </w:lvl>
+    <w:lvl w:ilvl="4" w:tplc="08090003" w:tentative="1">
+      <w:start w:val="1"/>
+      <w:numFmt w:val="bullet"/>
+      <w:lvlText w:val="o"/>
+      <w:lvlJc w:val="left"/>
+      <w:pPr>
+        <w:ind w:left="3600" w:hanging="360"/>
+      </w:pPr>
+      <w:rPr>
+        <w:rFonts w:ascii="Courier New" w:hAnsi="Courier New" w:cs="Courier New" w:hint="default"/>
+      </w:rPr>
+    </w:lvl>
+    <w:lvl w:ilvl="5" w:tplc="08090005" w:tentative="1">
+      <w:start w:val="1"/>
+      <w:numFmt w:val="bullet"/>
+      <w:lvlText w:val=""/>
+      <w:lvlJc w:val="left"/>
+      <w:pPr>
+        <w:ind w:left="4320" w:hanging="360"/>
+      </w:pPr>
+      <w:rPr>
+        <w:rFonts w:ascii="Wingdings" w:hAnsi="Wingdings" w:hint="default"/>
+      </w:rPr>
+    </w:lvl>
+    <w:lvl w:ilvl="6" w:tplc="08090001" w:tentative="1">
+      <w:start w:val="1"/>
+      <w:numFmt w:val="bullet"/>
+      <w:lvlText w:val=""/>
+      <w:lvlJc w:val="left"/>
+      <w:pPr>
+        <w:ind w:left="5040" w:hanging="360"/>
+      </w:pPr>
+      <w:rPr>
+        <w:rFonts w:ascii="Symbol" w:hAnsi="Symbol" w:hint="default"/>
+      </w:rPr>
+    </w:lvl>
+    <w:lvl w:ilvl="7" w:tplc="08090003" w:tentative="1">
+      <w:start w:val="1"/>
+      <w:numFmt w:val="bullet"/>
+      <w:lvlText w:val="o"/>
+      <w:lvlJc w:val="left"/>
+      <w:pPr>
+        <w:ind w:left="5760" w:hanging="360"/>
+      </w:pPr>
+      <w:rPr>
+        <w:rFonts w:ascii="Courier New" w:hAnsi="Courier New" w:cs="Courier New" w:hint="default"/>
+      </w:rPr>
+    </w:lvl>
+    <w:lvl w:ilvl="8" w:tplc="08090005" w:tentative="1">
+      <w:start w:val="1"/>
+      <w:numFmt w:val="bullet"/>
+      <w:lvlText w:val=""/>
+      <w:lvlJc w:val="left"/>
+      <w:pPr>
+        <w:ind w:left="6480" w:hanging="360"/>
+      </w:pPr>
+      <w:rPr>
+        <w:rFonts w:ascii="Wingdings" w:hAnsi="Wingdings" w:hint="default"/>
+      </w:rPr>
+    </w:lvl>
+  </w:abstractNum>
   <w:num w:numId="1" w16cid:durableId="390886898">
     <w:abstractNumId w:val="0"/>
   </w:num>
@@ -1068,6 +1636,12 @@
   </w:num>
   <w:num w:numId="3" w16cid:durableId="2057925475">
     <w:abstractNumId w:val="2"/>
+  </w:num>
+  <w:num w:numId="4" w16cid:durableId="1025521071">
+    <w:abstractNumId w:val="3"/>
+  </w:num>
+  <w:num w:numId="5" w16cid:durableId="1751922072">
+    <w:abstractNumId w:val="4"/>
   </w:num>
 </w:numbering>
 </file>

</xml_diff>